<commit_message>
Addes file Schematic.kicad_.lck , ALU-Forg26 and Bit-Mechanix - ALU-Forge26
</commit_message>
<xml_diff>
--- a/Bit Mechanix - ALU-Forge'26.docx
+++ b/Bit Mechanix - ALU-Forge'26.docx
@@ -242,15 +242,7 @@
           <w:sz w:val="28"/>
           <w:szCs w:val="28"/>
         </w:rPr>
-        <w:t>This project implements an 8-bit Arithmetic Logic Unit (ALU) using discrete digital logic ICs and a shared 8-bit bus architecture. Operands set via DIP switches are sequentially loaded into Registers A and B using push-button controls and a 1 Hz clock source. The operands are processed through an 8-bit adder/subtractor circuit—where addition or subtraction is determined by the carry-in control of the first adder stage</w:t>
-      </w:r>
-      <w:r>
-        <w:rPr>
-          <w:rFonts w:ascii="Times New Roman" w:hAnsi="Times New Roman" w:cs="Times New Roman"/>
-          <w:sz w:val="28"/>
-          <w:szCs w:val="28"/>
-        </w:rPr>
-        <w:t>.</w:t>
+        <w:t>This project implements an 8-bit Arithmetic Logic Unit (ALU) using discrete digital logic ICs and a shared 8-bit bus architecture. Operands set via DIP switches are sequentially loaded into Registers A and B using push-button controls and a 1 Hz clock source. The operands are processed through an 8-bit adder/subtractor circuit—where addition or subtraction is determined by the carry-in control of the first adder stage.</w:t>
       </w:r>
     </w:p>
     <w:p>
@@ -290,17 +282,7 @@
           <w:sz w:val="32"/>
           <w:szCs w:val="32"/>
         </w:rPr>
-        <w:t>Objectives</w:t>
-      </w:r>
-      <w:r>
-        <w:rPr>
-          <w:rFonts w:ascii="Times New Roman" w:hAnsi="Times New Roman" w:cs="Times New Roman"/>
-          <w:b/>
-          <w:bCs/>
-          <w:sz w:val="32"/>
-          <w:szCs w:val="32"/>
-        </w:rPr>
-        <w:t>:</w:t>
+        <w:t>Objectives:</w:t>
       </w:r>
     </w:p>
     <w:p>
@@ -1654,6 +1636,7 @@
           <w:rFonts w:ascii="Times New Roman" w:hAnsi="Times New Roman" w:cs="Times New Roman"/>
           <w:b/>
           <w:bCs/>
+          <w:noProof/>
           <w:sz w:val="32"/>
           <w:szCs w:val="32"/>
         </w:rPr>
@@ -1689,6 +1672,17 @@
         </w:rPr>
         <w:t xml:space="preserve"> Circuit:</w:t>
       </w:r>
+      <w:r>
+        <w:rPr>
+          <w:rFonts w:ascii="Times New Roman" w:hAnsi="Times New Roman" w:cs="Times New Roman"/>
+          <w:b/>
+          <w:bCs/>
+          <w:noProof/>
+          <w:sz w:val="32"/>
+          <w:szCs w:val="32"/>
+        </w:rPr>
+        <w:t xml:space="preserve"> </w:t>
+      </w:r>
     </w:p>
     <w:p>
       <w:pPr>
@@ -1700,116 +1694,69 @@
           <w:szCs w:val="32"/>
         </w:rPr>
       </w:pPr>
-    </w:p>
-    <w:p>
-      <w:pPr>
+      <w:r>
         <w:rPr>
           <w:rFonts w:ascii="Times New Roman" w:hAnsi="Times New Roman" w:cs="Times New Roman"/>
           <w:b/>
           <w:bCs/>
+          <w:noProof/>
           <w:sz w:val="32"/>
           <w:szCs w:val="32"/>
         </w:rPr>
-      </w:pPr>
-    </w:p>
-    <w:p>
-      <w:pPr>
-        <w:rPr>
-          <w:rFonts w:ascii="Times New Roman" w:hAnsi="Times New Roman" w:cs="Times New Roman"/>
-          <w:b/>
-          <w:bCs/>
-          <w:sz w:val="32"/>
-          <w:szCs w:val="32"/>
-        </w:rPr>
-      </w:pPr>
-    </w:p>
-    <w:p>
-      <w:pPr>
-        <w:rPr>
-          <w:rFonts w:ascii="Times New Roman" w:hAnsi="Times New Roman" w:cs="Times New Roman"/>
-          <w:b/>
-          <w:bCs/>
-          <w:sz w:val="32"/>
-          <w:szCs w:val="32"/>
-        </w:rPr>
-      </w:pPr>
-    </w:p>
-    <w:p>
-      <w:pPr>
-        <w:rPr>
-          <w:rFonts w:ascii="Times New Roman" w:hAnsi="Times New Roman" w:cs="Times New Roman"/>
-          <w:b/>
-          <w:bCs/>
-          <w:sz w:val="32"/>
-          <w:szCs w:val="32"/>
-        </w:rPr>
-      </w:pPr>
-    </w:p>
-    <w:p>
-      <w:pPr>
-        <w:rPr>
-          <w:rFonts w:ascii="Times New Roman" w:hAnsi="Times New Roman" w:cs="Times New Roman"/>
-          <w:b/>
-          <w:bCs/>
-          <w:sz w:val="32"/>
-          <w:szCs w:val="32"/>
-        </w:rPr>
-      </w:pPr>
-    </w:p>
-    <w:p>
-      <w:pPr>
-        <w:rPr>
-          <w:rFonts w:ascii="Times New Roman" w:hAnsi="Times New Roman" w:cs="Times New Roman"/>
-          <w:b/>
-          <w:bCs/>
-          <w:sz w:val="32"/>
-          <w:szCs w:val="32"/>
-        </w:rPr>
-      </w:pPr>
-    </w:p>
-    <w:p>
-      <w:pPr>
-        <w:rPr>
-          <w:rFonts w:ascii="Times New Roman" w:hAnsi="Times New Roman" w:cs="Times New Roman"/>
-          <w:b/>
-          <w:bCs/>
-          <w:sz w:val="32"/>
-          <w:szCs w:val="32"/>
-        </w:rPr>
-      </w:pPr>
-    </w:p>
-    <w:p>
-      <w:pPr>
-        <w:rPr>
-          <w:rFonts w:ascii="Times New Roman" w:hAnsi="Times New Roman" w:cs="Times New Roman"/>
-          <w:b/>
-          <w:bCs/>
-          <w:sz w:val="32"/>
-          <w:szCs w:val="32"/>
-        </w:rPr>
-      </w:pPr>
-    </w:p>
-    <w:p>
-      <w:pPr>
-        <w:rPr>
-          <w:rFonts w:ascii="Times New Roman" w:hAnsi="Times New Roman" w:cs="Times New Roman"/>
-          <w:b/>
-          <w:bCs/>
-          <w:sz w:val="32"/>
-          <w:szCs w:val="32"/>
-        </w:rPr>
-      </w:pPr>
-    </w:p>
-    <w:p>
-      <w:pPr>
-        <w:rPr>
-          <w:rFonts w:ascii="Times New Roman" w:hAnsi="Times New Roman" w:cs="Times New Roman"/>
-          <w:b/>
-          <w:bCs/>
-          <w:sz w:val="32"/>
-          <w:szCs w:val="32"/>
-        </w:rPr>
-      </w:pPr>
+        <w:drawing>
+          <wp:inline distT="0" distB="0" distL="0" distR="0" wp14:anchorId="7F4CD3B1" wp14:editId="41E9D405">
+            <wp:extent cx="2452667" cy="5641169"/>
+            <wp:effectExtent l="6032" t="0" r="0" b="0"/>
+            <wp:docPr id="813453326" name="Picture 14"/>
+            <wp:cNvGraphicFramePr>
+              <a:graphicFrameLocks xmlns:a="http://schemas.openxmlformats.org/drawingml/2006/main" noChangeAspect="1"/>
+            </wp:cNvGraphicFramePr>
+            <a:graphic xmlns:a="http://schemas.openxmlformats.org/drawingml/2006/main">
+              <a:graphicData uri="http://schemas.openxmlformats.org/drawingml/2006/picture">
+                <pic:pic xmlns:pic="http://schemas.openxmlformats.org/drawingml/2006/picture">
+                  <pic:nvPicPr>
+                    <pic:cNvPr id="0" name="Picture 3"/>
+                    <pic:cNvPicPr>
+                      <a:picLocks noChangeAspect="1" noChangeArrowheads="1"/>
+                    </pic:cNvPicPr>
+                  </pic:nvPicPr>
+                  <pic:blipFill rotWithShape="1">
+                    <a:blip r:embed="rId11" cstate="print">
+                      <a:extLst>
+                        <a:ext uri="{28A0092B-C50C-407E-A947-70E740481C1C}">
+                          <a14:useLocalDpi xmlns:a14="http://schemas.microsoft.com/office/drawing/2010/main" val="0"/>
+                        </a:ext>
+                      </a:extLst>
+                    </a:blip>
+                    <a:srcRect l="11300" t="9436" r="21715" b="3943"/>
+                    <a:stretch>
+                      <a:fillRect/>
+                    </a:stretch>
+                  </pic:blipFill>
+                  <pic:spPr bwMode="auto">
+                    <a:xfrm rot="16200000">
+                      <a:off x="0" y="0"/>
+                      <a:ext cx="2480142" cy="5704363"/>
+                    </a:xfrm>
+                    <a:prstGeom prst="rect">
+                      <a:avLst/>
+                    </a:prstGeom>
+                    <a:noFill/>
+                    <a:ln>
+                      <a:noFill/>
+                    </a:ln>
+                    <a:extLst>
+                      <a:ext uri="{53640926-AAD7-44D8-BBD7-CCE9431645EC}">
+                        <a14:shadowObscured xmlns:a14="http://schemas.microsoft.com/office/drawing/2010/main"/>
+                      </a:ext>
+                    </a:extLst>
+                  </pic:spPr>
+                </pic:pic>
+              </a:graphicData>
+            </a:graphic>
+          </wp:inline>
+        </w:drawing>
+      </w:r>
     </w:p>
     <w:p>
       <w:pPr>
@@ -2203,7 +2150,9 @@
           <w:szCs w:val="32"/>
         </w:rPr>
       </w:pPr>
-      <w:r>
+    </w:p>
+    <w:p>
+      <w:pPr>
         <w:rPr>
           <w:rFonts w:ascii="Times New Roman" w:hAnsi="Times New Roman" w:cs="Times New Roman"/>
           <w:b/>
@@ -2211,10 +2160,10 @@
           <w:sz w:val="32"/>
           <w:szCs w:val="32"/>
         </w:rPr>
-        <w:lastRenderedPageBreak/>
-        <w:t>7.</w:t>
-      </w:r>
-      <w:r>
+      </w:pPr>
+    </w:p>
+    <w:p>
+      <w:pPr>
         <w:rPr>
           <w:rFonts w:ascii="Times New Roman" w:hAnsi="Times New Roman" w:cs="Times New Roman"/>
           <w:b/>
@@ -2222,9 +2171,10 @@
           <w:sz w:val="32"/>
           <w:szCs w:val="32"/>
         </w:rPr>
-        <w:t xml:space="preserve"> </w:t>
-      </w:r>
-      <w:r>
+      </w:pPr>
+    </w:p>
+    <w:p>
+      <w:pPr>
         <w:rPr>
           <w:rFonts w:ascii="Times New Roman" w:hAnsi="Times New Roman" w:cs="Times New Roman"/>
           <w:b/>
@@ -2232,9 +2182,10 @@
           <w:sz w:val="32"/>
           <w:szCs w:val="32"/>
         </w:rPr>
-        <w:t xml:space="preserve"> A</w:t>
-      </w:r>
-      <w:r>
+      </w:pPr>
+    </w:p>
+    <w:p>
+      <w:pPr>
         <w:rPr>
           <w:rFonts w:ascii="Times New Roman" w:hAnsi="Times New Roman" w:cs="Times New Roman"/>
           <w:b/>
@@ -2242,8 +2193,7 @@
           <w:sz w:val="32"/>
           <w:szCs w:val="32"/>
         </w:rPr>
-        <w:t>-</w:t>
-      </w:r>
+      </w:pPr>
       <w:r>
         <w:rPr>
           <w:rFonts w:ascii="Times New Roman" w:hAnsi="Times New Roman" w:cs="Times New Roman"/>
@@ -2252,6 +2202,47 @@
           <w:sz w:val="32"/>
           <w:szCs w:val="32"/>
         </w:rPr>
+        <w:lastRenderedPageBreak/>
+        <w:t>7.</w:t>
+      </w:r>
+      <w:r>
+        <w:rPr>
+          <w:rFonts w:ascii="Times New Roman" w:hAnsi="Times New Roman" w:cs="Times New Roman"/>
+          <w:b/>
+          <w:bCs/>
+          <w:sz w:val="32"/>
+          <w:szCs w:val="32"/>
+        </w:rPr>
+        <w:t xml:space="preserve"> </w:t>
+      </w:r>
+      <w:r>
+        <w:rPr>
+          <w:rFonts w:ascii="Times New Roman" w:hAnsi="Times New Roman" w:cs="Times New Roman"/>
+          <w:b/>
+          <w:bCs/>
+          <w:sz w:val="32"/>
+          <w:szCs w:val="32"/>
+        </w:rPr>
+        <w:t xml:space="preserve"> A</w:t>
+      </w:r>
+      <w:r>
+        <w:rPr>
+          <w:rFonts w:ascii="Times New Roman" w:hAnsi="Times New Roman" w:cs="Times New Roman"/>
+          <w:b/>
+          <w:bCs/>
+          <w:sz w:val="32"/>
+          <w:szCs w:val="32"/>
+        </w:rPr>
+        <w:t>-</w:t>
+      </w:r>
+      <w:r>
+        <w:rPr>
+          <w:rFonts w:ascii="Times New Roman" w:hAnsi="Times New Roman" w:cs="Times New Roman"/>
+          <w:b/>
+          <w:bCs/>
+          <w:sz w:val="32"/>
+          <w:szCs w:val="32"/>
+        </w:rPr>
         <w:t>Register:</w:t>
       </w:r>
     </w:p>
@@ -2259,55 +2250,60 @@
       <w:pPr>
         <w:rPr>
           <w:rFonts w:ascii="Times New Roman" w:hAnsi="Times New Roman" w:cs="Times New Roman"/>
-          <w:sz w:val="28"/>
-          <w:szCs w:val="28"/>
-        </w:rPr>
-      </w:pPr>
-    </w:p>
-    <w:p>
-      <w:pPr>
-        <w:rPr>
-          <w:rFonts w:ascii="Times New Roman" w:hAnsi="Times New Roman" w:cs="Times New Roman"/>
-          <w:sz w:val="28"/>
-          <w:szCs w:val="28"/>
-        </w:rPr>
-      </w:pPr>
-    </w:p>
-    <w:p>
-      <w:pPr>
-        <w:rPr>
-          <w:rFonts w:ascii="Times New Roman" w:hAnsi="Times New Roman" w:cs="Times New Roman"/>
-          <w:sz w:val="28"/>
-          <w:szCs w:val="28"/>
-        </w:rPr>
-      </w:pPr>
-    </w:p>
-    <w:p>
-      <w:pPr>
-        <w:rPr>
-          <w:rFonts w:ascii="Times New Roman" w:hAnsi="Times New Roman" w:cs="Times New Roman"/>
-          <w:sz w:val="28"/>
-          <w:szCs w:val="28"/>
-        </w:rPr>
-      </w:pPr>
-    </w:p>
-    <w:p>
-      <w:pPr>
-        <w:rPr>
-          <w:rFonts w:ascii="Times New Roman" w:hAnsi="Times New Roman" w:cs="Times New Roman"/>
-          <w:sz w:val="28"/>
-          <w:szCs w:val="28"/>
-        </w:rPr>
-      </w:pPr>
-    </w:p>
-    <w:p>
-      <w:pPr>
-        <w:rPr>
-          <w:rFonts w:ascii="Times New Roman" w:hAnsi="Times New Roman" w:cs="Times New Roman"/>
-          <w:sz w:val="28"/>
-          <w:szCs w:val="28"/>
-        </w:rPr>
-      </w:pPr>
+          <w:noProof/>
+          <w:sz w:val="28"/>
+          <w:szCs w:val="28"/>
+        </w:rPr>
+      </w:pPr>
+      <w:r>
+        <w:rPr>
+          <w:rFonts w:ascii="Times New Roman" w:hAnsi="Times New Roman" w:cs="Times New Roman"/>
+          <w:noProof/>
+          <w:sz w:val="28"/>
+          <w:szCs w:val="28"/>
+        </w:rPr>
+        <w:drawing>
+          <wp:inline distT="0" distB="0" distL="0" distR="0" wp14:anchorId="0931FC7A" wp14:editId="46FEF1A0">
+            <wp:extent cx="5731510" cy="1755140"/>
+            <wp:effectExtent l="0" t="0" r="2540" b="0"/>
+            <wp:docPr id="1602410444" name="Picture 19"/>
+            <wp:cNvGraphicFramePr>
+              <a:graphicFrameLocks xmlns:a="http://schemas.openxmlformats.org/drawingml/2006/main" noChangeAspect="1"/>
+            </wp:cNvGraphicFramePr>
+            <a:graphic xmlns:a="http://schemas.openxmlformats.org/drawingml/2006/main">
+              <a:graphicData uri="http://schemas.openxmlformats.org/drawingml/2006/picture">
+                <pic:pic xmlns:pic="http://schemas.openxmlformats.org/drawingml/2006/picture">
+                  <pic:nvPicPr>
+                    <pic:cNvPr id="1602410444" name="Picture 1602410444"/>
+                    <pic:cNvPicPr/>
+                  </pic:nvPicPr>
+                  <pic:blipFill>
+                    <a:blip r:embed="rId12">
+                      <a:extLst>
+                        <a:ext uri="{28A0092B-C50C-407E-A947-70E740481C1C}">
+                          <a14:useLocalDpi xmlns:a14="http://schemas.microsoft.com/office/drawing/2010/main" val="0"/>
+                        </a:ext>
+                      </a:extLst>
+                    </a:blip>
+                    <a:stretch>
+                      <a:fillRect/>
+                    </a:stretch>
+                  </pic:blipFill>
+                  <pic:spPr>
+                    <a:xfrm>
+                      <a:off x="0" y="0"/>
+                      <a:ext cx="5731510" cy="1755140"/>
+                    </a:xfrm>
+                    <a:prstGeom prst="rect">
+                      <a:avLst/>
+                    </a:prstGeom>
+                  </pic:spPr>
+                </pic:pic>
+              </a:graphicData>
+            </a:graphic>
+          </wp:inline>
+        </w:drawing>
+      </w:r>
     </w:p>
     <w:p>
       <w:pPr>
@@ -3062,9 +3058,7 @@
           <w:szCs w:val="32"/>
         </w:rPr>
       </w:pPr>
-    </w:p>
-    <w:p>
-      <w:pPr>
+      <w:r>
         <w:rPr>
           <w:rFonts w:ascii="Times New Roman" w:hAnsi="Times New Roman" w:cs="Times New Roman"/>
           <w:b/>
@@ -3072,7 +3066,9 @@
           <w:sz w:val="32"/>
           <w:szCs w:val="32"/>
         </w:rPr>
-      </w:pPr>
+        <w:lastRenderedPageBreak/>
+        <w:t>8.</w:t>
+      </w:r>
       <w:r>
         <w:rPr>
           <w:rFonts w:ascii="Times New Roman" w:hAnsi="Times New Roman" w:cs="Times New Roman"/>
@@ -3081,7 +3077,7 @@
           <w:sz w:val="32"/>
           <w:szCs w:val="32"/>
         </w:rPr>
-        <w:t>8.</w:t>
+        <w:t xml:space="preserve"> </w:t>
       </w:r>
       <w:r>
         <w:rPr>
@@ -3091,7 +3087,7 @@
           <w:sz w:val="32"/>
           <w:szCs w:val="32"/>
         </w:rPr>
-        <w:t xml:space="preserve"> </w:t>
+        <w:t>B</w:t>
       </w:r>
       <w:r>
         <w:rPr>
@@ -3101,7 +3097,7 @@
           <w:sz w:val="32"/>
           <w:szCs w:val="32"/>
         </w:rPr>
-        <w:t>B</w:t>
+        <w:t>-</w:t>
       </w:r>
       <w:r>
         <w:rPr>
@@ -3111,7 +3107,7 @@
           <w:sz w:val="32"/>
           <w:szCs w:val="32"/>
         </w:rPr>
-        <w:t>-</w:t>
+        <w:t>Register</w:t>
       </w:r>
       <w:r>
         <w:rPr>
@@ -3121,17 +3117,65 @@
           <w:sz w:val="32"/>
           <w:szCs w:val="32"/>
         </w:rPr>
-        <w:t>Register</w:t>
-      </w:r>
-      <w:r>
-        <w:rPr>
-          <w:rFonts w:ascii="Times New Roman" w:hAnsi="Times New Roman" w:cs="Times New Roman"/>
-          <w:b/>
-          <w:bCs/>
-          <w:sz w:val="32"/>
-          <w:szCs w:val="32"/>
-        </w:rPr>
         <w:t>:</w:t>
+      </w:r>
+      <w:r>
+        <w:rPr>
+          <w:rFonts w:ascii="Times New Roman" w:hAnsi="Times New Roman" w:cs="Times New Roman"/>
+          <w:noProof/>
+          <w:sz w:val="28"/>
+          <w:szCs w:val="28"/>
+        </w:rPr>
+        <w:t xml:space="preserve"> </w:t>
+      </w:r>
+      <w:r>
+        <w:rPr>
+          <w:rFonts w:ascii="Times New Roman" w:hAnsi="Times New Roman" w:cs="Times New Roman"/>
+          <w:noProof/>
+          <w:sz w:val="28"/>
+          <w:szCs w:val="28"/>
+        </w:rPr>
+        <w:drawing>
+          <wp:inline distT="0" distB="0" distL="0" distR="0" wp14:anchorId="072AFE23" wp14:editId="33008911">
+            <wp:extent cx="5731510" cy="2310765"/>
+            <wp:effectExtent l="0" t="0" r="2540" b="0"/>
+            <wp:docPr id="1098716988" name="Picture 15"/>
+            <wp:cNvGraphicFramePr>
+              <a:graphicFrameLocks xmlns:a="http://schemas.openxmlformats.org/drawingml/2006/main" noChangeAspect="1"/>
+            </wp:cNvGraphicFramePr>
+            <a:graphic xmlns:a="http://schemas.openxmlformats.org/drawingml/2006/main">
+              <a:graphicData uri="http://schemas.openxmlformats.org/drawingml/2006/picture">
+                <pic:pic xmlns:pic="http://schemas.openxmlformats.org/drawingml/2006/picture">
+                  <pic:nvPicPr>
+                    <pic:cNvPr id="1098716988" name="Picture 1098716988"/>
+                    <pic:cNvPicPr/>
+                  </pic:nvPicPr>
+                  <pic:blipFill>
+                    <a:blip r:embed="rId13">
+                      <a:extLst>
+                        <a:ext uri="{28A0092B-C50C-407E-A947-70E740481C1C}">
+                          <a14:useLocalDpi xmlns:a14="http://schemas.microsoft.com/office/drawing/2010/main" val="0"/>
+                        </a:ext>
+                      </a:extLst>
+                    </a:blip>
+                    <a:stretch>
+                      <a:fillRect/>
+                    </a:stretch>
+                  </pic:blipFill>
+                  <pic:spPr>
+                    <a:xfrm>
+                      <a:off x="0" y="0"/>
+                      <a:ext cx="5731510" cy="2310765"/>
+                    </a:xfrm>
+                    <a:prstGeom prst="rect">
+                      <a:avLst/>
+                    </a:prstGeom>
+                  </pic:spPr>
+                </pic:pic>
+              </a:graphicData>
+            </a:graphic>
+          </wp:inline>
+        </w:drawing>
       </w:r>
     </w:p>
     <w:p>
@@ -3142,49 +3186,12 @@
           <w:szCs w:val="28"/>
         </w:rPr>
       </w:pPr>
-    </w:p>
-    <w:p>
-      <w:pPr>
-        <w:rPr>
-          <w:rFonts w:ascii="Times New Roman" w:hAnsi="Times New Roman" w:cs="Times New Roman"/>
-          <w:sz w:val="28"/>
-          <w:szCs w:val="28"/>
-        </w:rPr>
-      </w:pPr>
-    </w:p>
-    <w:p>
-      <w:pPr>
-        <w:rPr>
-          <w:rFonts w:ascii="Times New Roman" w:hAnsi="Times New Roman" w:cs="Times New Roman"/>
-          <w:sz w:val="28"/>
-          <w:szCs w:val="28"/>
-        </w:rPr>
-      </w:pPr>
-    </w:p>
-    <w:p>
-      <w:pPr>
-        <w:rPr>
-          <w:rFonts w:ascii="Times New Roman" w:hAnsi="Times New Roman" w:cs="Times New Roman"/>
-          <w:sz w:val="28"/>
-          <w:szCs w:val="28"/>
-        </w:rPr>
-      </w:pPr>
-    </w:p>
-    <w:p>
-      <w:pPr>
-        <w:rPr>
-          <w:rFonts w:ascii="Times New Roman" w:hAnsi="Times New Roman" w:cs="Times New Roman"/>
-          <w:sz w:val="28"/>
-          <w:szCs w:val="28"/>
-        </w:rPr>
-      </w:pPr>
-      <w:r>
-        <w:rPr>
-          <w:rFonts w:ascii="Times New Roman" w:hAnsi="Times New Roman" w:cs="Times New Roman"/>
-          <w:sz w:val="28"/>
-          <w:szCs w:val="28"/>
-        </w:rPr>
-        <w:lastRenderedPageBreak/>
+      <w:r>
+        <w:rPr>
+          <w:rFonts w:ascii="Times New Roman" w:hAnsi="Times New Roman" w:cs="Times New Roman"/>
+          <w:sz w:val="28"/>
+          <w:szCs w:val="28"/>
+        </w:rPr>
         <w:t>Register B stores the second operand. It is loaded from the same common bus using its own enable control. Keeping the operands in separate registers allows the arithmetic section to receive two stable operand values</w:t>
       </w:r>
       <w:r>
@@ -3794,8 +3801,69 @@
       <w:pPr>
         <w:rPr>
           <w:rFonts w:ascii="Times New Roman" w:hAnsi="Times New Roman" w:cs="Times New Roman"/>
-          <w:sz w:val="28"/>
-          <w:szCs w:val="28"/>
+          <w:b/>
+          <w:sz w:val="32"/>
+          <w:szCs w:val="32"/>
+        </w:rPr>
+      </w:pPr>
+    </w:p>
+    <w:p>
+      <w:pPr>
+        <w:rPr>
+          <w:rFonts w:ascii="Times New Roman" w:hAnsi="Times New Roman" w:cs="Times New Roman"/>
+          <w:b/>
+          <w:sz w:val="32"/>
+          <w:szCs w:val="32"/>
+        </w:rPr>
+      </w:pPr>
+    </w:p>
+    <w:p>
+      <w:pPr>
+        <w:rPr>
+          <w:rFonts w:ascii="Times New Roman" w:hAnsi="Times New Roman" w:cs="Times New Roman"/>
+          <w:b/>
+          <w:sz w:val="32"/>
+          <w:szCs w:val="32"/>
+        </w:rPr>
+      </w:pPr>
+    </w:p>
+    <w:p>
+      <w:pPr>
+        <w:rPr>
+          <w:rFonts w:ascii="Times New Roman" w:hAnsi="Times New Roman" w:cs="Times New Roman"/>
+          <w:b/>
+          <w:sz w:val="32"/>
+          <w:szCs w:val="32"/>
+        </w:rPr>
+      </w:pPr>
+    </w:p>
+    <w:p>
+      <w:pPr>
+        <w:rPr>
+          <w:rFonts w:ascii="Times New Roman" w:hAnsi="Times New Roman" w:cs="Times New Roman"/>
+          <w:b/>
+          <w:sz w:val="32"/>
+          <w:szCs w:val="32"/>
+        </w:rPr>
+      </w:pPr>
+    </w:p>
+    <w:p>
+      <w:pPr>
+        <w:rPr>
+          <w:rFonts w:ascii="Times New Roman" w:hAnsi="Times New Roman" w:cs="Times New Roman"/>
+          <w:b/>
+          <w:sz w:val="32"/>
+          <w:szCs w:val="32"/>
+        </w:rPr>
+      </w:pPr>
+    </w:p>
+    <w:p>
+      <w:pPr>
+        <w:rPr>
+          <w:rFonts w:ascii="Times New Roman" w:hAnsi="Times New Roman" w:cs="Times New Roman"/>
+          <w:b/>
+          <w:sz w:val="32"/>
+          <w:szCs w:val="32"/>
         </w:rPr>
       </w:pPr>
     </w:p>
@@ -3812,6 +3880,70 @@
       <w:r>
         <w:rPr>
           <w:rFonts w:ascii="Times New Roman" w:hAnsi="Times New Roman" w:cs="Times New Roman"/>
+          <w:noProof/>
+          <w:sz w:val="28"/>
+          <w:szCs w:val="28"/>
+        </w:rPr>
+        <w:lastRenderedPageBreak/>
+        <w:drawing>
+          <wp:anchor distT="0" distB="0" distL="114300" distR="114300" simplePos="0" relativeHeight="251708928" behindDoc="0" locked="0" layoutInCell="1" allowOverlap="1" wp14:anchorId="2BDE6165" wp14:editId="0E5C9053">
+            <wp:simplePos x="0" y="0"/>
+            <wp:positionH relativeFrom="margin">
+              <wp:align>left</wp:align>
+            </wp:positionH>
+            <wp:positionV relativeFrom="paragraph">
+              <wp:posOffset>-614045</wp:posOffset>
+            </wp:positionV>
+            <wp:extent cx="2678931" cy="4816347"/>
+            <wp:effectExtent l="0" t="1905" r="5715" b="5715"/>
+            <wp:wrapNone/>
+            <wp:docPr id="490392088" name="Picture 12"/>
+            <wp:cNvGraphicFramePr>
+              <a:graphicFrameLocks xmlns:a="http://schemas.openxmlformats.org/drawingml/2006/main" noChangeAspect="1"/>
+            </wp:cNvGraphicFramePr>
+            <a:graphic xmlns:a="http://schemas.openxmlformats.org/drawingml/2006/main">
+              <a:graphicData uri="http://schemas.openxmlformats.org/drawingml/2006/picture">
+                <pic:pic xmlns:pic="http://schemas.openxmlformats.org/drawingml/2006/picture">
+                  <pic:nvPicPr>
+                    <pic:cNvPr id="490392088" name="Picture 490392088"/>
+                    <pic:cNvPicPr/>
+                  </pic:nvPicPr>
+                  <pic:blipFill>
+                    <a:blip r:embed="rId14" cstate="print">
+                      <a:extLst>
+                        <a:ext uri="{28A0092B-C50C-407E-A947-70E740481C1C}">
+                          <a14:useLocalDpi xmlns:a14="http://schemas.microsoft.com/office/drawing/2010/main" val="0"/>
+                        </a:ext>
+                      </a:extLst>
+                    </a:blip>
+                    <a:stretch>
+                      <a:fillRect/>
+                    </a:stretch>
+                  </pic:blipFill>
+                  <pic:spPr>
+                    <a:xfrm rot="5400000">
+                      <a:off x="0" y="0"/>
+                      <a:ext cx="2678931" cy="4816347"/>
+                    </a:xfrm>
+                    <a:prstGeom prst="rect">
+                      <a:avLst/>
+                    </a:prstGeom>
+                  </pic:spPr>
+                </pic:pic>
+              </a:graphicData>
+            </a:graphic>
+            <wp14:sizeRelH relativeFrom="page">
+              <wp14:pctWidth>0</wp14:pctWidth>
+            </wp14:sizeRelH>
+            <wp14:sizeRelV relativeFrom="page">
+              <wp14:pctHeight>0</wp14:pctHeight>
+            </wp14:sizeRelV>
+          </wp:anchor>
+        </w:drawing>
+      </w:r>
+      <w:r>
+        <w:rPr>
+          <w:rFonts w:ascii="Times New Roman" w:hAnsi="Times New Roman" w:cs="Times New Roman"/>
           <w:b/>
           <w:sz w:val="32"/>
           <w:szCs w:val="32"/>
@@ -3953,7 +4085,6 @@
           <w:szCs w:val="28"/>
           <w:u w:val="single"/>
         </w:rPr>
-        <w:lastRenderedPageBreak/>
         <w:t>Components List:</w:t>
       </w:r>
     </w:p>
@@ -4432,22 +4563,15 @@
       <w:pPr>
         <w:rPr>
           <w:rFonts w:ascii="Times New Roman" w:hAnsi="Times New Roman" w:cs="Times New Roman"/>
-          <w:sz w:val="28"/>
-          <w:szCs w:val="28"/>
-        </w:rPr>
-      </w:pPr>
-    </w:p>
-    <w:p>
-      <w:pPr>
-        <w:rPr>
-          <w:rFonts w:ascii="Times New Roman" w:hAnsi="Times New Roman" w:cs="Times New Roman"/>
           <w:b/>
           <w:bCs/>
           <w:sz w:val="32"/>
           <w:szCs w:val="32"/>
         </w:rPr>
       </w:pPr>
-      <w:r>
+    </w:p>
+    <w:p>
+      <w:pPr>
         <w:rPr>
           <w:rFonts w:ascii="Times New Roman" w:hAnsi="Times New Roman" w:cs="Times New Roman"/>
           <w:b/>
@@ -4455,8 +4579,17 @@
           <w:sz w:val="32"/>
           <w:szCs w:val="32"/>
         </w:rPr>
-        <w:t xml:space="preserve">10. </w:t>
-      </w:r>
+      </w:pPr>
+    </w:p>
+    <w:p>
+      <w:pPr>
+        <w:rPr>
+          <w:rFonts w:ascii="Times New Roman" w:hAnsi="Times New Roman" w:cs="Times New Roman"/>
+          <w:noProof/>
+          <w:sz w:val="28"/>
+          <w:szCs w:val="28"/>
+        </w:rPr>
+      </w:pPr>
       <w:r>
         <w:rPr>
           <w:rFonts w:ascii="Times New Roman" w:hAnsi="Times New Roman" w:cs="Times New Roman"/>
@@ -4465,17 +4598,88 @@
           <w:sz w:val="32"/>
           <w:szCs w:val="32"/>
         </w:rPr>
+        <w:lastRenderedPageBreak/>
+        <w:t xml:space="preserve">10. </w:t>
+      </w:r>
+      <w:r>
+        <w:rPr>
+          <w:rFonts w:ascii="Times New Roman" w:hAnsi="Times New Roman" w:cs="Times New Roman"/>
+          <w:b/>
+          <w:bCs/>
+          <w:sz w:val="32"/>
+          <w:szCs w:val="32"/>
+        </w:rPr>
         <w:t>The ALU Unit:</w:t>
+      </w:r>
+      <w:r>
+        <w:rPr>
+          <w:rFonts w:ascii="Times New Roman" w:hAnsi="Times New Roman" w:cs="Times New Roman"/>
+          <w:noProof/>
+          <w:sz w:val="28"/>
+          <w:szCs w:val="28"/>
+        </w:rPr>
+        <w:t xml:space="preserve"> </w:t>
       </w:r>
     </w:p>
     <w:p>
       <w:pPr>
         <w:rPr>
           <w:rFonts w:ascii="Times New Roman" w:hAnsi="Times New Roman" w:cs="Times New Roman"/>
-          <w:sz w:val="28"/>
-          <w:szCs w:val="28"/>
-        </w:rPr>
-      </w:pPr>
+          <w:b/>
+          <w:bCs/>
+          <w:sz w:val="32"/>
+          <w:szCs w:val="32"/>
+        </w:rPr>
+      </w:pPr>
+      <w:r>
+        <w:rPr>
+          <w:rFonts w:ascii="Times New Roman" w:hAnsi="Times New Roman" w:cs="Times New Roman"/>
+          <w:noProof/>
+          <w:sz w:val="28"/>
+          <w:szCs w:val="28"/>
+        </w:rPr>
+        <w:drawing>
+          <wp:inline distT="0" distB="0" distL="0" distR="0" wp14:anchorId="7D94D259" wp14:editId="26E0850A">
+            <wp:extent cx="5731510" cy="1749425"/>
+            <wp:effectExtent l="0" t="0" r="2540" b="3175"/>
+            <wp:docPr id="32789247" name="Picture 20"/>
+            <wp:cNvGraphicFramePr>
+              <a:graphicFrameLocks xmlns:a="http://schemas.openxmlformats.org/drawingml/2006/main" noChangeAspect="1"/>
+            </wp:cNvGraphicFramePr>
+            <a:graphic xmlns:a="http://schemas.openxmlformats.org/drawingml/2006/main">
+              <a:graphicData uri="http://schemas.openxmlformats.org/drawingml/2006/picture">
+                <pic:pic xmlns:pic="http://schemas.openxmlformats.org/drawingml/2006/picture">
+                  <pic:nvPicPr>
+                    <pic:cNvPr id="32789247" name="Picture 32789247"/>
+                    <pic:cNvPicPr/>
+                  </pic:nvPicPr>
+                  <pic:blipFill>
+                    <a:blip r:embed="rId15" cstate="print">
+                      <a:extLst>
+                        <a:ext uri="{28A0092B-C50C-407E-A947-70E740481C1C}">
+                          <a14:useLocalDpi xmlns:a14="http://schemas.microsoft.com/office/drawing/2010/main" val="0"/>
+                        </a:ext>
+                      </a:extLst>
+                    </a:blip>
+                    <a:stretch>
+                      <a:fillRect/>
+                    </a:stretch>
+                  </pic:blipFill>
+                  <pic:spPr>
+                    <a:xfrm>
+                      <a:off x="0" y="0"/>
+                      <a:ext cx="5731510" cy="1749425"/>
+                    </a:xfrm>
+                    <a:prstGeom prst="rect">
+                      <a:avLst/>
+                    </a:prstGeom>
+                  </pic:spPr>
+                </pic:pic>
+              </a:graphicData>
+            </a:graphic>
+          </wp:inline>
+        </w:drawing>
+      </w:r>
     </w:p>
     <w:p>
       <w:pPr>
@@ -4485,6 +4689,14 @@
           <w:szCs w:val="28"/>
         </w:rPr>
       </w:pPr>
+      <w:r>
+        <w:rPr>
+          <w:rFonts w:ascii="Times New Roman" w:hAnsi="Times New Roman" w:cs="Times New Roman"/>
+          <w:sz w:val="28"/>
+          <w:szCs w:val="28"/>
+        </w:rPr>
+        <w:t>The arithmetic unit takes the 8-bit values held in Register A and Register B and produces an 8-bit result. It is built from cascaded adder stages, so the carry from each bit position ripples into the next higher-order bit.</w:t>
+      </w:r>
     </w:p>
     <w:p>
       <w:pPr>
@@ -4494,6 +4706,14 @@
           <w:szCs w:val="28"/>
         </w:rPr>
       </w:pPr>
+      <w:r>
+        <w:rPr>
+          <w:rFonts w:ascii="Times New Roman" w:hAnsi="Times New Roman" w:cs="Times New Roman"/>
+          <w:sz w:val="28"/>
+          <w:szCs w:val="28"/>
+        </w:rPr>
+        <w:t>Operation is selected using a single control line, taken as the carry-in (Cin) of the first adder stage. This same Cin line is also fed to a bank of XOR gates on the B inputs, so it controls both the 1's complement of B and the +1 needed to complete the 2's complement:</w:t>
+      </w:r>
     </w:p>
     <w:p>
       <w:pPr>
@@ -4503,6 +4723,30 @@
           <w:szCs w:val="28"/>
         </w:rPr>
       </w:pPr>
+      <w:r>
+        <w:rPr>
+          <w:rFonts w:ascii="Times New Roman" w:hAnsi="Times New Roman" w:cs="Times New Roman" w:hint="eastAsia"/>
+          <w:sz w:val="28"/>
+          <w:szCs w:val="28"/>
+        </w:rPr>
+        <w:t xml:space="preserve">Addition (Cin = 0): XOR gates pass B unchanged </w:t>
+      </w:r>
+      <w:r>
+        <w:rPr>
+          <w:rFonts w:ascii="Times New Roman" w:hAnsi="Times New Roman" w:cs="Times New Roman" w:hint="eastAsia"/>
+          <w:sz w:val="28"/>
+          <w:szCs w:val="28"/>
+        </w:rPr>
+        <w:t>→</w:t>
+      </w:r>
+      <w:r>
+        <w:rPr>
+          <w:rFonts w:ascii="Times New Roman" w:hAnsi="Times New Roman" w:cs="Times New Roman" w:hint="eastAsia"/>
+          <w:sz w:val="28"/>
+          <w:szCs w:val="28"/>
+        </w:rPr>
+        <w:t xml:space="preserve"> Result = A + B</w:t>
+      </w:r>
     </w:p>
     <w:p>
       <w:pPr>
@@ -4512,107 +4756,12 @@
           <w:szCs w:val="28"/>
         </w:rPr>
       </w:pPr>
-    </w:p>
-    <w:p>
-      <w:pPr>
-        <w:rPr>
-          <w:rFonts w:ascii="Times New Roman" w:hAnsi="Times New Roman" w:cs="Times New Roman"/>
-          <w:sz w:val="28"/>
-          <w:szCs w:val="28"/>
-        </w:rPr>
-      </w:pPr>
-    </w:p>
-    <w:p>
-      <w:pPr>
-        <w:rPr>
-          <w:rFonts w:ascii="Times New Roman" w:hAnsi="Times New Roman" w:cs="Times New Roman"/>
-          <w:sz w:val="28"/>
-          <w:szCs w:val="28"/>
-        </w:rPr>
-      </w:pPr>
-    </w:p>
-    <w:p>
-      <w:pPr>
-        <w:rPr>
-          <w:rFonts w:ascii="Times New Roman" w:hAnsi="Times New Roman" w:cs="Times New Roman"/>
-          <w:sz w:val="28"/>
-          <w:szCs w:val="28"/>
-        </w:rPr>
-      </w:pPr>
-      <w:r>
-        <w:rPr>
-          <w:rFonts w:ascii="Times New Roman" w:hAnsi="Times New Roman" w:cs="Times New Roman"/>
-          <w:sz w:val="28"/>
-          <w:szCs w:val="28"/>
-        </w:rPr>
-        <w:t>The arithmetic unit takes the 8-bit values held in Register A and Register B and produces an 8-bit result. It is built from cascaded adder stages, so the carry from each bit position ripples into the next higher-order bit.</w:t>
-      </w:r>
-    </w:p>
-    <w:p>
-      <w:pPr>
-        <w:rPr>
-          <w:rFonts w:ascii="Times New Roman" w:hAnsi="Times New Roman" w:cs="Times New Roman"/>
-          <w:sz w:val="28"/>
-          <w:szCs w:val="28"/>
-        </w:rPr>
-      </w:pPr>
-      <w:r>
-        <w:rPr>
-          <w:rFonts w:ascii="Times New Roman" w:hAnsi="Times New Roman" w:cs="Times New Roman"/>
-          <w:sz w:val="28"/>
-          <w:szCs w:val="28"/>
-        </w:rPr>
-        <w:t>Operation is selected using a single control line, taken as the carry-in (Cin) of the first adder stage. This same Cin line is also fed to a bank of XOR gates on the B inputs, so it controls both the 1's complement of B and the +1 needed to complete the 2's complement:</w:t>
-      </w:r>
-    </w:p>
-    <w:p>
-      <w:pPr>
-        <w:rPr>
-          <w:rFonts w:ascii="Times New Roman" w:hAnsi="Times New Roman" w:cs="Times New Roman"/>
-          <w:sz w:val="28"/>
-          <w:szCs w:val="28"/>
-        </w:rPr>
-      </w:pPr>
-      <w:r>
-        <w:rPr>
-          <w:rFonts w:ascii="Times New Roman" w:hAnsi="Times New Roman" w:cs="Times New Roman" w:hint="eastAsia"/>
-          <w:sz w:val="28"/>
-          <w:szCs w:val="28"/>
-        </w:rPr>
-        <w:t xml:space="preserve">Addition (Cin = 0): XOR gates pass B unchanged </w:t>
-      </w:r>
-      <w:r>
-        <w:rPr>
-          <w:rFonts w:ascii="Times New Roman" w:hAnsi="Times New Roman" w:cs="Times New Roman" w:hint="eastAsia"/>
-          <w:sz w:val="28"/>
-          <w:szCs w:val="28"/>
-        </w:rPr>
-        <w:t>→</w:t>
-      </w:r>
-      <w:r>
-        <w:rPr>
-          <w:rFonts w:ascii="Times New Roman" w:hAnsi="Times New Roman" w:cs="Times New Roman" w:hint="eastAsia"/>
-          <w:sz w:val="28"/>
-          <w:szCs w:val="28"/>
-        </w:rPr>
-        <w:t xml:space="preserve"> Result = A + B</w:t>
-      </w:r>
-    </w:p>
-    <w:p>
-      <w:pPr>
-        <w:rPr>
-          <w:rFonts w:ascii="Times New Roman" w:hAnsi="Times New Roman" w:cs="Times New Roman"/>
-          <w:sz w:val="28"/>
-          <w:szCs w:val="28"/>
-        </w:rPr>
-      </w:pPr>
-      <w:r>
-        <w:rPr>
-          <w:rFonts w:ascii="Times New Roman" w:hAnsi="Times New Roman" w:cs="Times New Roman"/>
-          <w:sz w:val="28"/>
-          <w:szCs w:val="28"/>
-        </w:rPr>
-        <w:lastRenderedPageBreak/>
+      <w:r>
+        <w:rPr>
+          <w:rFonts w:ascii="Times New Roman" w:hAnsi="Times New Roman" w:cs="Times New Roman"/>
+          <w:sz w:val="28"/>
+          <w:szCs w:val="28"/>
+        </w:rPr>
         <w:t xml:space="preserve">Subtraction (Cin = 1): XOR gates invert B (1's complement) and Cin adds the final 1 </w:t>
       </w:r>
       <w:r>
@@ -4809,7 +4958,15 @@
                 <w:sz w:val="28"/>
                 <w:szCs w:val="28"/>
               </w:rPr>
-              <w:t>IC 74283</w:t>
+              <w:t>IC 74</w:t>
+            </w:r>
+            <w:r>
+              <w:rPr>
+                <w:rFonts w:ascii="Times New Roman" w:hAnsi="Times New Roman" w:cs="Times New Roman"/>
+                <w:sz w:val="28"/>
+                <w:szCs w:val="28"/>
+              </w:rPr>
+              <w:t>008</w:t>
             </w:r>
           </w:p>
         </w:tc>
@@ -5401,6 +5558,7 @@
                 <w:sz w:val="28"/>
                 <w:szCs w:val="28"/>
               </w:rPr>
+              <w:lastRenderedPageBreak/>
               <w:t>Resistor (330 ohm)</w:t>
             </w:r>
           </w:p>
@@ -5570,6 +5728,86 @@
       <w:r>
         <w:rPr>
           <w:rFonts w:ascii="Times New Roman" w:hAnsi="Times New Roman" w:cs="Times New Roman"/>
+          <w:noProof/>
+          <w:sz w:val="28"/>
+          <w:szCs w:val="28"/>
+        </w:rPr>
+        <w:drawing>
+          <wp:anchor distT="0" distB="0" distL="114300" distR="114300" simplePos="0" relativeHeight="251709952" behindDoc="0" locked="0" layoutInCell="1" allowOverlap="1" wp14:anchorId="4169CEAD" wp14:editId="15DEFEC5">
+            <wp:simplePos x="0" y="0"/>
+            <wp:positionH relativeFrom="margin">
+              <wp:posOffset>-635</wp:posOffset>
+            </wp:positionH>
+            <wp:positionV relativeFrom="paragraph">
+              <wp:posOffset>367665</wp:posOffset>
+            </wp:positionV>
+            <wp:extent cx="2085975" cy="2152015"/>
+            <wp:effectExtent l="0" t="0" r="9525" b="635"/>
+            <wp:wrapThrough wrapText="bothSides">
+              <wp:wrapPolygon edited="0">
+                <wp:start x="0" y="0"/>
+                <wp:lineTo x="0" y="21415"/>
+                <wp:lineTo x="21501" y="21415"/>
+                <wp:lineTo x="21501" y="0"/>
+                <wp:lineTo x="0" y="0"/>
+              </wp:wrapPolygon>
+            </wp:wrapThrough>
+            <wp:docPr id="129169687" name="Picture 21"/>
+            <wp:cNvGraphicFramePr>
+              <a:graphicFrameLocks xmlns:a="http://schemas.openxmlformats.org/drawingml/2006/main" noChangeAspect="1"/>
+            </wp:cNvGraphicFramePr>
+            <a:graphic xmlns:a="http://schemas.openxmlformats.org/drawingml/2006/main">
+              <a:graphicData uri="http://schemas.openxmlformats.org/drawingml/2006/picture">
+                <pic:pic xmlns:pic="http://schemas.openxmlformats.org/drawingml/2006/picture">
+                  <pic:nvPicPr>
+                    <pic:cNvPr id="129169687" name="Picture 129169687"/>
+                    <pic:cNvPicPr/>
+                  </pic:nvPicPr>
+                  <pic:blipFill rotWithShape="1">
+                    <a:blip r:embed="rId16" cstate="print">
+                      <a:extLst>
+                        <a:ext uri="{28A0092B-C50C-407E-A947-70E740481C1C}">
+                          <a14:useLocalDpi xmlns:a14="http://schemas.microsoft.com/office/drawing/2010/main" val="0"/>
+                        </a:ext>
+                      </a:extLst>
+                    </a:blip>
+                    <a:srcRect l="66142"/>
+                    <a:stretch>
+                      <a:fillRect/>
+                    </a:stretch>
+                  </pic:blipFill>
+                  <pic:spPr bwMode="auto">
+                    <a:xfrm>
+                      <a:off x="0" y="0"/>
+                      <a:ext cx="2085975" cy="2152015"/>
+                    </a:xfrm>
+                    <a:prstGeom prst="rect">
+                      <a:avLst/>
+                    </a:prstGeom>
+                    <a:ln>
+                      <a:noFill/>
+                    </a:ln>
+                    <a:extLst>
+                      <a:ext uri="{53640926-AAD7-44D8-BBD7-CCE9431645EC}">
+                        <a14:shadowObscured xmlns:a14="http://schemas.microsoft.com/office/drawing/2010/main"/>
+                      </a:ext>
+                    </a:extLst>
+                  </pic:spPr>
+                </pic:pic>
+              </a:graphicData>
+            </a:graphic>
+            <wp14:sizeRelH relativeFrom="margin">
+              <wp14:pctWidth>0</wp14:pctWidth>
+            </wp14:sizeRelH>
+            <wp14:sizeRelV relativeFrom="margin">
+              <wp14:pctHeight>0</wp14:pctHeight>
+            </wp14:sizeRelV>
+          </wp:anchor>
+        </w:drawing>
+      </w:r>
+      <w:r>
+        <w:rPr>
+          <w:rFonts w:ascii="Times New Roman" w:hAnsi="Times New Roman" w:cs="Times New Roman"/>
           <w:b/>
           <w:bCs/>
           <w:sz w:val="32"/>
@@ -5592,80 +5830,17 @@
       <w:pPr>
         <w:rPr>
           <w:rFonts w:ascii="Times New Roman" w:hAnsi="Times New Roman" w:cs="Times New Roman"/>
-          <w:sz w:val="28"/>
-          <w:szCs w:val="28"/>
-        </w:rPr>
-      </w:pPr>
-    </w:p>
-    <w:p>
-      <w:pPr>
-        <w:rPr>
-          <w:rFonts w:ascii="Times New Roman" w:hAnsi="Times New Roman" w:cs="Times New Roman"/>
-          <w:sz w:val="28"/>
-          <w:szCs w:val="28"/>
-        </w:rPr>
-      </w:pPr>
-    </w:p>
-    <w:p>
-      <w:pPr>
-        <w:rPr>
-          <w:rFonts w:ascii="Times New Roman" w:hAnsi="Times New Roman" w:cs="Times New Roman"/>
-          <w:sz w:val="28"/>
-          <w:szCs w:val="28"/>
-        </w:rPr>
-      </w:pPr>
-    </w:p>
-    <w:p>
-      <w:pPr>
-        <w:rPr>
-          <w:rFonts w:ascii="Times New Roman" w:hAnsi="Times New Roman" w:cs="Times New Roman"/>
-          <w:sz w:val="28"/>
-          <w:szCs w:val="28"/>
-        </w:rPr>
-      </w:pPr>
-    </w:p>
-    <w:p>
-      <w:pPr>
-        <w:rPr>
-          <w:rFonts w:ascii="Times New Roman" w:hAnsi="Times New Roman" w:cs="Times New Roman"/>
-          <w:sz w:val="28"/>
-          <w:szCs w:val="28"/>
-        </w:rPr>
-      </w:pPr>
-    </w:p>
-    <w:p>
-      <w:pPr>
-        <w:rPr>
-          <w:rFonts w:ascii="Times New Roman" w:hAnsi="Times New Roman" w:cs="Times New Roman"/>
-          <w:sz w:val="28"/>
-          <w:szCs w:val="28"/>
-        </w:rPr>
-      </w:pPr>
-    </w:p>
-    <w:p>
-      <w:pPr>
-        <w:rPr>
-          <w:rFonts w:ascii="Times New Roman" w:hAnsi="Times New Roman" w:cs="Times New Roman"/>
-          <w:sz w:val="28"/>
-          <w:szCs w:val="28"/>
-        </w:rPr>
-      </w:pPr>
-    </w:p>
-    <w:p>
-      <w:pPr>
-        <w:rPr>
-          <w:rFonts w:ascii="Times New Roman" w:hAnsi="Times New Roman" w:cs="Times New Roman"/>
-          <w:sz w:val="28"/>
-          <w:szCs w:val="28"/>
-        </w:rPr>
-      </w:pPr>
-      <w:r>
-        <w:rPr>
-          <w:rFonts w:ascii="Times New Roman" w:hAnsi="Times New Roman" w:cs="Times New Roman"/>
-          <w:sz w:val="28"/>
-          <w:szCs w:val="28"/>
-        </w:rPr>
-        <w:lastRenderedPageBreak/>
+          <w:noProof/>
+          <w:sz w:val="28"/>
+          <w:szCs w:val="28"/>
+        </w:rPr>
+      </w:pPr>
+      <w:r>
+        <w:rPr>
+          <w:rFonts w:ascii="Times New Roman" w:hAnsi="Times New Roman" w:cs="Times New Roman"/>
+          <w:sz w:val="28"/>
+          <w:szCs w:val="28"/>
+        </w:rPr>
         <w:t>The 1 Hz clock serves as a predictable timing reference to synchronize sequential operations—such as loading data into registers and transferring signals across the data</w:t>
       </w:r>
       <w:r>
@@ -6269,7 +6444,6 @@
           <w:tcPr>
             <w:tcW w:w="4159" w:type="dxa"/>
             <w:vAlign w:val="center"/>
-            <w:hideMark/>
           </w:tcPr>
           <w:p>
             <w:pPr>
@@ -6294,7 +6468,6 @@
           <w:tcPr>
             <w:tcW w:w="0" w:type="auto"/>
             <w:vAlign w:val="center"/>
-            <w:hideMark/>
           </w:tcPr>
           <w:p>
             <w:pPr>
@@ -6319,7 +6492,6 @@
           <w:tcPr>
             <w:tcW w:w="3523" w:type="dxa"/>
             <w:vAlign w:val="center"/>
-            <w:hideMark/>
           </w:tcPr>
           <w:p>
             <w:pPr>
@@ -6370,7 +6542,9 @@
           <w:szCs w:val="32"/>
         </w:rPr>
       </w:pPr>
-      <w:r>
+    </w:p>
+    <w:p>
+      <w:pPr>
         <w:rPr>
           <w:rFonts w:ascii="Times New Roman" w:hAnsi="Times New Roman" w:cs="Times New Roman"/>
           <w:b/>
@@ -6378,7 +6552,537 @@
           <w:sz w:val="32"/>
           <w:szCs w:val="32"/>
         </w:rPr>
-        <w:t xml:space="preserve">12. </w:t>
+      </w:pPr>
+      <w:r>
+        <w:rPr>
+          <w:rFonts w:ascii="Times New Roman" w:hAnsi="Times New Roman" w:cs="Times New Roman"/>
+          <w:b/>
+          <w:bCs/>
+          <w:sz w:val="32"/>
+          <w:szCs w:val="32"/>
+        </w:rPr>
+        <w:lastRenderedPageBreak/>
+        <w:t>12.</w:t>
+      </w:r>
+      <w:r>
+        <w:rPr>
+          <w:rFonts w:ascii="Times New Roman" w:hAnsi="Times New Roman" w:cs="Times New Roman"/>
+          <w:b/>
+          <w:bCs/>
+          <w:sz w:val="32"/>
+          <w:szCs w:val="32"/>
+        </w:rPr>
+        <w:t xml:space="preserve"> Additional </w:t>
+      </w:r>
+      <w:r>
+        <w:rPr>
+          <w:rFonts w:ascii="Times New Roman" w:hAnsi="Times New Roman" w:cs="Times New Roman"/>
+          <w:b/>
+          <w:bCs/>
+          <w:sz w:val="32"/>
+          <w:szCs w:val="32"/>
+        </w:rPr>
+        <w:t>Design</w:t>
+      </w:r>
+      <w:r>
+        <w:rPr>
+          <w:rFonts w:ascii="Times New Roman" w:hAnsi="Times New Roman" w:cs="Times New Roman"/>
+          <w:b/>
+          <w:bCs/>
+          <w:sz w:val="32"/>
+          <w:szCs w:val="32"/>
+        </w:rPr>
+        <w:t>s</w:t>
+      </w:r>
+      <w:r>
+        <w:rPr>
+          <w:rFonts w:ascii="Times New Roman" w:hAnsi="Times New Roman" w:cs="Times New Roman"/>
+          <w:b/>
+          <w:bCs/>
+          <w:sz w:val="32"/>
+          <w:szCs w:val="32"/>
+        </w:rPr>
+        <w:t>:</w:t>
+      </w:r>
+    </w:p>
+    <w:p>
+      <w:pPr>
+        <w:rPr>
+          <w:rFonts w:ascii="Times New Roman" w:hAnsi="Times New Roman" w:cs="Times New Roman"/>
+          <w:sz w:val="28"/>
+          <w:szCs w:val="28"/>
+        </w:rPr>
+      </w:pPr>
+      <w:r>
+        <w:rPr>
+          <w:rFonts w:ascii="Times New Roman" w:hAnsi="Times New Roman" w:cs="Times New Roman"/>
+          <w:sz w:val="28"/>
+          <w:szCs w:val="28"/>
+          <w:u w:val="single"/>
+        </w:rPr>
+        <w:t>OR Logic:</w:t>
+      </w:r>
+      <w:r>
+        <w:rPr>
+          <w:rFonts w:ascii="Times New Roman" w:hAnsi="Times New Roman" w:cs="Times New Roman"/>
+          <w:sz w:val="28"/>
+          <w:szCs w:val="28"/>
+        </w:rPr>
+        <w:t xml:space="preserve"> </w:t>
+      </w:r>
+      <w:r>
+        <w:rPr>
+          <w:rFonts w:ascii="Times New Roman" w:hAnsi="Times New Roman" w:cs="Times New Roman"/>
+          <w:sz w:val="28"/>
+          <w:szCs w:val="28"/>
+        </w:rPr>
+        <w:t>This block performs the bit-wise logical OR operation of the 2 register outputs.</w:t>
+      </w:r>
+    </w:p>
+    <w:p>
+      <w:pPr>
+        <w:rPr>
+          <w:rFonts w:ascii="Times New Roman" w:hAnsi="Times New Roman" w:cs="Times New Roman"/>
+          <w:sz w:val="28"/>
+          <w:szCs w:val="28"/>
+        </w:rPr>
+      </w:pPr>
+      <w:r>
+        <w:rPr>
+          <w:rFonts w:ascii="Times New Roman" w:hAnsi="Times New Roman" w:cs="Times New Roman"/>
+          <w:noProof/>
+          <w:sz w:val="28"/>
+          <w:szCs w:val="28"/>
+        </w:rPr>
+        <w:drawing>
+          <wp:inline distT="0" distB="0" distL="0" distR="0" wp14:anchorId="0A3F0F0A" wp14:editId="7945BFC1">
+            <wp:extent cx="2231801" cy="5810957"/>
+            <wp:effectExtent l="952" t="0" r="0" b="0"/>
+            <wp:docPr id="1613240026" name="Picture 15"/>
+            <wp:cNvGraphicFramePr>
+              <a:graphicFrameLocks xmlns:a="http://schemas.openxmlformats.org/drawingml/2006/main" noChangeAspect="1"/>
+            </wp:cNvGraphicFramePr>
+            <a:graphic xmlns:a="http://schemas.openxmlformats.org/drawingml/2006/main">
+              <a:graphicData uri="http://schemas.openxmlformats.org/drawingml/2006/picture">
+                <pic:pic xmlns:pic="http://schemas.openxmlformats.org/drawingml/2006/picture">
+                  <pic:nvPicPr>
+                    <pic:cNvPr id="1613240026" name="Picture 1613240026"/>
+                    <pic:cNvPicPr/>
+                  </pic:nvPicPr>
+                  <pic:blipFill rotWithShape="1">
+                    <a:blip r:embed="rId17">
+                      <a:extLst>
+                        <a:ext uri="{28A0092B-C50C-407E-A947-70E740481C1C}">
+                          <a14:useLocalDpi xmlns:a14="http://schemas.microsoft.com/office/drawing/2010/main" val="0"/>
+                        </a:ext>
+                      </a:extLst>
+                    </a:blip>
+                    <a:srcRect l="27377" t="25153" r="24790" b="4822"/>
+                    <a:stretch>
+                      <a:fillRect/>
+                    </a:stretch>
+                  </pic:blipFill>
+                  <pic:spPr bwMode="auto">
+                    <a:xfrm rot="16200000">
+                      <a:off x="0" y="0"/>
+                      <a:ext cx="2248981" cy="5855689"/>
+                    </a:xfrm>
+                    <a:prstGeom prst="rect">
+                      <a:avLst/>
+                    </a:prstGeom>
+                    <a:ln>
+                      <a:noFill/>
+                    </a:ln>
+                    <a:extLst>
+                      <a:ext uri="{53640926-AAD7-44D8-BBD7-CCE9431645EC}">
+                        <a14:shadowObscured xmlns:a14="http://schemas.microsoft.com/office/drawing/2010/main"/>
+                      </a:ext>
+                    </a:extLst>
+                  </pic:spPr>
+                </pic:pic>
+              </a:graphicData>
+            </a:graphic>
+          </wp:inline>
+        </w:drawing>
+      </w:r>
+    </w:p>
+    <w:p>
+      <w:pPr>
+        <w:rPr>
+          <w:rFonts w:ascii="Times New Roman" w:hAnsi="Times New Roman" w:cs="Times New Roman"/>
+          <w:sz w:val="28"/>
+          <w:szCs w:val="28"/>
+        </w:rPr>
+      </w:pPr>
+    </w:p>
+    <w:p>
+      <w:pPr>
+        <w:rPr>
+          <w:rFonts w:ascii="Times New Roman" w:hAnsi="Times New Roman" w:cs="Times New Roman"/>
+          <w:sz w:val="28"/>
+          <w:szCs w:val="28"/>
+        </w:rPr>
+      </w:pPr>
+      <w:r>
+        <w:rPr>
+          <w:rFonts w:ascii="Times New Roman" w:hAnsi="Times New Roman" w:cs="Times New Roman"/>
+          <w:sz w:val="28"/>
+          <w:szCs w:val="28"/>
+          <w:u w:val="single"/>
+        </w:rPr>
+        <w:t>AND Logic:</w:t>
+      </w:r>
+      <w:r>
+        <w:rPr>
+          <w:rFonts w:ascii="Times New Roman" w:hAnsi="Times New Roman" w:cs="Times New Roman"/>
+          <w:sz w:val="28"/>
+          <w:szCs w:val="28"/>
+        </w:rPr>
+        <w:t xml:space="preserve"> </w:t>
+      </w:r>
+      <w:r>
+        <w:rPr>
+          <w:rFonts w:ascii="Times New Roman" w:hAnsi="Times New Roman" w:cs="Times New Roman"/>
+          <w:sz w:val="28"/>
+          <w:szCs w:val="28"/>
+        </w:rPr>
+        <w:t>This block performs the bit-wise</w:t>
+      </w:r>
+      <w:r>
+        <w:rPr>
+          <w:rFonts w:ascii="Times New Roman" w:hAnsi="Times New Roman" w:cs="Times New Roman"/>
+          <w:sz w:val="28"/>
+          <w:szCs w:val="28"/>
+        </w:rPr>
+        <w:t xml:space="preserve"> logical</w:t>
+      </w:r>
+      <w:r>
+        <w:rPr>
+          <w:rFonts w:ascii="Times New Roman" w:hAnsi="Times New Roman" w:cs="Times New Roman"/>
+          <w:sz w:val="28"/>
+          <w:szCs w:val="28"/>
+        </w:rPr>
+        <w:t xml:space="preserve"> AND operation of the </w:t>
+      </w:r>
+      <w:r>
+        <w:rPr>
+          <w:rFonts w:ascii="Times New Roman" w:hAnsi="Times New Roman" w:cs="Times New Roman"/>
+          <w:sz w:val="28"/>
+          <w:szCs w:val="28"/>
+        </w:rPr>
+        <w:t>2 register outputs.</w:t>
+      </w:r>
+    </w:p>
+    <w:p>
+      <w:pPr>
+        <w:rPr>
+          <w:rFonts w:ascii="Times New Roman" w:hAnsi="Times New Roman" w:cs="Times New Roman"/>
+          <w:sz w:val="28"/>
+          <w:szCs w:val="28"/>
+        </w:rPr>
+      </w:pPr>
+      <w:r>
+        <w:rPr>
+          <w:rFonts w:ascii="Times New Roman" w:hAnsi="Times New Roman" w:cs="Times New Roman"/>
+          <w:noProof/>
+          <w:sz w:val="28"/>
+          <w:szCs w:val="28"/>
+        </w:rPr>
+        <w:drawing>
+          <wp:inline distT="0" distB="0" distL="0" distR="0" wp14:anchorId="020D5BCB" wp14:editId="3641D040">
+            <wp:extent cx="1713709" cy="4990225"/>
+            <wp:effectExtent l="0" t="0" r="1270" b="1270"/>
+            <wp:docPr id="944673174" name="Picture 16"/>
+            <wp:cNvGraphicFramePr>
+              <a:graphicFrameLocks xmlns:a="http://schemas.openxmlformats.org/drawingml/2006/main" noChangeAspect="1"/>
+            </wp:cNvGraphicFramePr>
+            <a:graphic xmlns:a="http://schemas.openxmlformats.org/drawingml/2006/main">
+              <a:graphicData uri="http://schemas.openxmlformats.org/drawingml/2006/picture">
+                <pic:pic xmlns:pic="http://schemas.openxmlformats.org/drawingml/2006/picture">
+                  <pic:nvPicPr>
+                    <pic:cNvPr id="944673174" name="Picture 944673174"/>
+                    <pic:cNvPicPr/>
+                  </pic:nvPicPr>
+                  <pic:blipFill rotWithShape="1">
+                    <a:blip r:embed="rId18" cstate="print">
+                      <a:extLst>
+                        <a:ext uri="{28A0092B-C50C-407E-A947-70E740481C1C}">
+                          <a14:useLocalDpi xmlns:a14="http://schemas.microsoft.com/office/drawing/2010/main" val="0"/>
+                        </a:ext>
+                      </a:extLst>
+                    </a:blip>
+                    <a:srcRect l="20924" t="14921" r="28266" b="1888"/>
+                    <a:stretch>
+                      <a:fillRect/>
+                    </a:stretch>
+                  </pic:blipFill>
+                  <pic:spPr bwMode="auto">
+                    <a:xfrm rot="16200000">
+                      <a:off x="0" y="0"/>
+                      <a:ext cx="1719478" cy="5007024"/>
+                    </a:xfrm>
+                    <a:prstGeom prst="rect">
+                      <a:avLst/>
+                    </a:prstGeom>
+                    <a:ln>
+                      <a:noFill/>
+                    </a:ln>
+                    <a:extLst>
+                      <a:ext uri="{53640926-AAD7-44D8-BBD7-CCE9431645EC}">
+                        <a14:shadowObscured xmlns:a14="http://schemas.microsoft.com/office/drawing/2010/main"/>
+                      </a:ext>
+                    </a:extLst>
+                  </pic:spPr>
+                </pic:pic>
+              </a:graphicData>
+            </a:graphic>
+          </wp:inline>
+        </w:drawing>
+      </w:r>
+    </w:p>
+    <w:p>
+      <w:pPr>
+        <w:rPr>
+          <w:rFonts w:ascii="Times New Roman" w:hAnsi="Times New Roman" w:cs="Times New Roman"/>
+          <w:sz w:val="28"/>
+          <w:szCs w:val="28"/>
+        </w:rPr>
+      </w:pPr>
+    </w:p>
+    <w:p>
+      <w:pPr>
+        <w:rPr>
+          <w:rFonts w:ascii="Times New Roman" w:hAnsi="Times New Roman" w:cs="Times New Roman"/>
+          <w:sz w:val="28"/>
+          <w:szCs w:val="28"/>
+        </w:rPr>
+      </w:pPr>
+      <w:r>
+        <w:rPr>
+          <w:rFonts w:ascii="Times New Roman" w:hAnsi="Times New Roman" w:cs="Times New Roman"/>
+          <w:sz w:val="28"/>
+          <w:szCs w:val="28"/>
+          <w:u w:val="single"/>
+        </w:rPr>
+        <w:t>Clock Buzzer:</w:t>
+      </w:r>
+      <w:r>
+        <w:rPr>
+          <w:rFonts w:ascii="Times New Roman" w:hAnsi="Times New Roman" w:cs="Times New Roman"/>
+          <w:sz w:val="28"/>
+          <w:szCs w:val="28"/>
+        </w:rPr>
+        <w:t xml:space="preserve"> T</w:t>
+      </w:r>
+      <w:r>
+        <w:rPr>
+          <w:rFonts w:ascii="Times New Roman" w:hAnsi="Times New Roman" w:cs="Times New Roman"/>
+          <w:sz w:val="28"/>
+          <w:szCs w:val="28"/>
+        </w:rPr>
+        <w:t>he here is used to indicate the clock pulse as a sound.</w:t>
+      </w:r>
+    </w:p>
+    <w:p>
+      <w:pPr>
+        <w:rPr>
+          <w:rFonts w:ascii="Times New Roman" w:hAnsi="Times New Roman" w:cs="Times New Roman"/>
+          <w:sz w:val="28"/>
+          <w:szCs w:val="28"/>
+        </w:rPr>
+      </w:pPr>
+      <w:r>
+        <w:rPr>
+          <w:rFonts w:ascii="Times New Roman" w:hAnsi="Times New Roman" w:cs="Times New Roman"/>
+          <w:noProof/>
+          <w:sz w:val="28"/>
+          <w:szCs w:val="28"/>
+        </w:rPr>
+        <w:drawing>
+          <wp:inline distT="0" distB="0" distL="0" distR="0" wp14:anchorId="5F5BD52C" wp14:editId="1678E04E">
+            <wp:extent cx="1435735" cy="2004695"/>
+            <wp:effectExtent l="0" t="0" r="0" b="0"/>
+            <wp:docPr id="165511363" name="Picture 18"/>
+            <wp:cNvGraphicFramePr>
+              <a:graphicFrameLocks xmlns:a="http://schemas.openxmlformats.org/drawingml/2006/main" noChangeAspect="1"/>
+            </wp:cNvGraphicFramePr>
+            <a:graphic xmlns:a="http://schemas.openxmlformats.org/drawingml/2006/main">
+              <a:graphicData uri="http://schemas.openxmlformats.org/drawingml/2006/picture">
+                <pic:pic xmlns:pic="http://schemas.openxmlformats.org/drawingml/2006/picture">
+                  <pic:nvPicPr>
+                    <pic:cNvPr id="165511363" name="Picture 165511363"/>
+                    <pic:cNvPicPr/>
+                  </pic:nvPicPr>
+                  <pic:blipFill rotWithShape="1">
+                    <a:blip r:embed="rId19" cstate="print">
+                      <a:extLst>
+                        <a:ext uri="{28A0092B-C50C-407E-A947-70E740481C1C}">
+                          <a14:useLocalDpi xmlns:a14="http://schemas.microsoft.com/office/drawing/2010/main" val="0"/>
+                        </a:ext>
+                      </a:extLst>
+                    </a:blip>
+                    <a:srcRect l="74950"/>
+                    <a:stretch>
+                      <a:fillRect/>
+                    </a:stretch>
+                  </pic:blipFill>
+                  <pic:spPr bwMode="auto">
+                    <a:xfrm>
+                      <a:off x="0" y="0"/>
+                      <a:ext cx="1435735" cy="2004695"/>
+                    </a:xfrm>
+                    <a:prstGeom prst="rect">
+                      <a:avLst/>
+                    </a:prstGeom>
+                    <a:ln>
+                      <a:noFill/>
+                    </a:ln>
+                    <a:extLst>
+                      <a:ext uri="{53640926-AAD7-44D8-BBD7-CCE9431645EC}">
+                        <a14:shadowObscured xmlns:a14="http://schemas.microsoft.com/office/drawing/2010/main"/>
+                      </a:ext>
+                    </a:extLst>
+                  </pic:spPr>
+                </pic:pic>
+              </a:graphicData>
+            </a:graphic>
+          </wp:inline>
+        </w:drawing>
+      </w:r>
+    </w:p>
+    <w:p>
+      <w:pPr>
+        <w:rPr>
+          <w:rFonts w:ascii="Times New Roman" w:hAnsi="Times New Roman" w:cs="Times New Roman"/>
+          <w:b/>
+          <w:bCs/>
+          <w:sz w:val="32"/>
+          <w:szCs w:val="32"/>
+        </w:rPr>
+      </w:pPr>
+    </w:p>
+    <w:p>
+      <w:pPr>
+        <w:rPr>
+          <w:rFonts w:ascii="Times New Roman" w:hAnsi="Times New Roman" w:cs="Times New Roman"/>
+          <w:b/>
+          <w:bCs/>
+          <w:sz w:val="32"/>
+          <w:szCs w:val="32"/>
+        </w:rPr>
+      </w:pPr>
+      <w:r>
+        <w:rPr>
+          <w:rFonts w:ascii="Times New Roman" w:hAnsi="Times New Roman" w:cs="Times New Roman"/>
+          <w:b/>
+          <w:bCs/>
+          <w:sz w:val="32"/>
+          <w:szCs w:val="32"/>
+        </w:rPr>
+        <w:t>13.</w:t>
+      </w:r>
+      <w:r>
+        <w:rPr>
+          <w:rFonts w:ascii="Times New Roman" w:hAnsi="Times New Roman" w:cs="Times New Roman"/>
+          <w:b/>
+          <w:bCs/>
+          <w:sz w:val="32"/>
+          <w:szCs w:val="32"/>
+        </w:rPr>
+        <w:t xml:space="preserve"> Schematic Design:</w:t>
+      </w:r>
+    </w:p>
+    <w:p>
+      <w:pPr>
+        <w:rPr>
+          <w:rFonts w:ascii="Times New Roman" w:hAnsi="Times New Roman" w:cs="Times New Roman"/>
+          <w:b/>
+          <w:bCs/>
+          <w:sz w:val="32"/>
+          <w:szCs w:val="32"/>
+        </w:rPr>
+      </w:pPr>
+      <w:r>
+        <w:rPr>
+          <w:rFonts w:ascii="Times New Roman" w:hAnsi="Times New Roman" w:cs="Times New Roman"/>
+          <w:b/>
+          <w:bCs/>
+          <w:noProof/>
+          <w:sz w:val="32"/>
+          <w:szCs w:val="32"/>
+        </w:rPr>
+        <w:drawing>
+          <wp:inline distT="0" distB="0" distL="0" distR="0" wp14:anchorId="60B3BFA8" wp14:editId="15B9DDA6">
+            <wp:extent cx="5731510" cy="3888105"/>
+            <wp:effectExtent l="0" t="0" r="2540" b="0"/>
+            <wp:docPr id="2107224687" name="Picture 11"/>
+            <wp:cNvGraphicFramePr>
+              <a:graphicFrameLocks xmlns:a="http://schemas.openxmlformats.org/drawingml/2006/main" noChangeAspect="1"/>
+            </wp:cNvGraphicFramePr>
+            <a:graphic xmlns:a="http://schemas.openxmlformats.org/drawingml/2006/main">
+              <a:graphicData uri="http://schemas.openxmlformats.org/drawingml/2006/picture">
+                <pic:pic xmlns:pic="http://schemas.openxmlformats.org/drawingml/2006/picture">
+                  <pic:nvPicPr>
+                    <pic:cNvPr id="2107224687" name="Picture 2107224687"/>
+                    <pic:cNvPicPr/>
+                  </pic:nvPicPr>
+                  <pic:blipFill>
+                    <a:blip r:embed="rId20" cstate="print">
+                      <a:extLst>
+                        <a:ext uri="{28A0092B-C50C-407E-A947-70E740481C1C}">
+                          <a14:useLocalDpi xmlns:a14="http://schemas.microsoft.com/office/drawing/2010/main" val="0"/>
+                        </a:ext>
+                      </a:extLst>
+                    </a:blip>
+                    <a:stretch>
+                      <a:fillRect/>
+                    </a:stretch>
+                  </pic:blipFill>
+                  <pic:spPr>
+                    <a:xfrm>
+                      <a:off x="0" y="0"/>
+                      <a:ext cx="5731510" cy="3888105"/>
+                    </a:xfrm>
+                    <a:prstGeom prst="rect">
+                      <a:avLst/>
+                    </a:prstGeom>
+                  </pic:spPr>
+                </pic:pic>
+              </a:graphicData>
+            </a:graphic>
+          </wp:inline>
+        </w:drawing>
+      </w:r>
+    </w:p>
+    <w:p>
+      <w:pPr>
+        <w:rPr>
+          <w:rFonts w:ascii="Times New Roman" w:hAnsi="Times New Roman" w:cs="Times New Roman"/>
+          <w:b/>
+          <w:bCs/>
+          <w:sz w:val="32"/>
+          <w:szCs w:val="32"/>
+        </w:rPr>
+      </w:pPr>
+      <w:r>
+        <w:rPr>
+          <w:rFonts w:ascii="Times New Roman" w:hAnsi="Times New Roman" w:cs="Times New Roman"/>
+          <w:b/>
+          <w:bCs/>
+          <w:sz w:val="32"/>
+          <w:szCs w:val="32"/>
+        </w:rPr>
+        <w:t>14.</w:t>
+      </w:r>
+      <w:r>
+        <w:rPr>
+          <w:rFonts w:ascii="Times New Roman" w:hAnsi="Times New Roman" w:cs="Times New Roman"/>
+          <w:b/>
+          <w:bCs/>
+          <w:sz w:val="32"/>
+          <w:szCs w:val="32"/>
+        </w:rPr>
+        <w:t xml:space="preserve"> </w:t>
       </w:r>
       <w:r>
         <w:rPr>
@@ -6412,7 +7116,7 @@
         </w:rPr>
         <w:t xml:space="preserve">Website Link: </w:t>
       </w:r>
-      <w:hyperlink r:id="rId11" w:history="1">
+      <w:hyperlink r:id="rId21" w:history="1">
         <w:r>
           <w:rPr>
             <w:rStyle w:val="Hyperlink"/>
@@ -6453,7 +7157,7 @@
         </w:rPr>
         <w:t xml:space="preserve"> </w:t>
       </w:r>
-      <w:hyperlink r:id="rId12" w:history="1">
+      <w:hyperlink r:id="rId22" w:history="1">
         <w:r>
           <w:rPr>
             <w:rStyle w:val="Hyperlink"/>
@@ -7768,6 +8472,7 @@
   <w:style w:type="character" w:default="1" w:styleId="DefaultParagraphFont">
     <w:name w:val="Default Paragraph Font"/>
     <w:uiPriority w:val="1"/>
+    <w:semiHidden/>
     <w:unhideWhenUsed/>
   </w:style>
   <w:style w:type="table" w:default="1" w:styleId="TableNormal">

</xml_diff>